<commit_message>
Correct Kubit and ASEE employment dates in portfolio and CV
</commit_message>
<xml_diff>
--- a/dist/Bardhi-Vula-CV.docx
+++ b/dist/Bardhi-Vula-CV.docx
@@ -3085,7 +3085,7 @@
           <w:spacing w:val="-4"/>
           <w:sz w:val="16"/>
         </w:rPr>
-        <w:t>2024</w:t>
+        <w:t>2025</w:t>
       </w:r>
     </w:p>
     <w:p>
@@ -5364,7 +5364,7 @@
           <w:color w:val="5D5D5D"/>
           <w:sz w:val="16"/>
         </w:rPr>
-        <w:t>2024</w:t>
+        <w:t>2025</w:t>
       </w:r>
       <w:r>
         <w:rPr>

</xml_diff>